<commit_message>
Add summary chart: muzzle velocity vs barrel length
New Figure 6 in section 10.2 plots muzzle velocity continuously over 5-26 in
with the standard service configurations marked (Mk18 10.3 in, M4 14.5 in,
16 in, 18 in, M16A2 20 in) and their velocities tabulated inline. Later
figures renumbered 7-11.

Co-Authored-By: Claude Opus 5 <noreply@anthropic.com>
Claude-Session: https://claude.ai/code/session_01JKNPGJJVv9VHMwp6Y1ZdKV
</commit_message>
<xml_diff>
--- a/doc/5.56_interior_ballistics.docx
+++ b/doc/5.56_interior_ballistics.docx
@@ -78,7 +78,7 @@
       <w:r>
         <w:t xml:space="preserve">Model, source code and this document: </w:t>
       </w:r>
-      <w:hyperlink w:history="1" r:id="rIdmwpbzdqmjhua0ulksun4v">
+      <w:hyperlink w:history="1" r:id="rIdfsgec4pjbloxlh0ojm-6f">
         <w:r>
           <w:rPr>
             <w:rStyle w:val="Hyperlink"/>
@@ -23607,6 +23607,76 @@
         <w:t xml:space="preserve">The table below is the central result. It is the same data the simulator produces interactively, tabulated at the barrel lengths of practical interest — 10.3 in (Mk18 CQBR), 11.5 in, 14.5 in (M4), 16 in (civilian minimum), 18 in, 20 in (M16A2/A4).</w:t>
       </w:r>
     </w:p>
+    <w:p>
+      <w:pPr>
+        <w:spacing w:after="60" w:before="180" w:line="240" w:lineRule="auto"/>
+        <w:jc w:val="center"/>
+      </w:pPr>
+      <w:r>
+        <w:drawing>
+          <wp:inline distT="0" distB="0" distL="0" distR="0">
+            <wp:extent cx="5577840" cy="3295650"/>
+            <wp:effectExtent t="0" r="0" b="0" l="0"/>
+            <wp:docPr id="1" name="" descr="" title=""/>
+            <wp:cNvGraphicFramePr>
+              <a:graphicFrameLocks xmlns:a="http://schemas.openxmlformats.org/drawingml/2006/main" noChangeAspect="1"/>
+            </wp:cNvGraphicFramePr>
+            <a:graphic xmlns:a="http://schemas.openxmlformats.org/drawingml/2006/main">
+              <a:graphicData uri="http://schemas.openxmlformats.org/drawingml/2006/picture">
+                <pic:pic xmlns:pic="http://schemas.openxmlformats.org/drawingml/2006/picture">
+                  <pic:nvPicPr>
+                    <pic:cNvPr id="0" name="" descr=""/>
+                    <pic:cNvPicPr>
+                      <a:picLocks noChangeAspect="1" noChangeArrowheads="1"/>
+                    </pic:cNvPicPr>
+                  </pic:nvPicPr>
+                  <pic:blipFill>
+                    <a:blip r:embed="rId14" cstate="none"/>
+                    <a:srcRect/>
+                    <a:stretch>
+                      <a:fillRect/>
+                    </a:stretch>
+                  </pic:blipFill>
+                  <pic:spPr bwMode="auto">
+                    <a:xfrm>
+                      <a:off x="0" y="0"/>
+                      <a:ext cx="5577840" cy="3295650"/>
+                    </a:xfrm>
+                    <a:prstGeom prst="rect">
+                      <a:avLst/>
+                    </a:prstGeom>
+                  </pic:spPr>
+                </pic:pic>
+              </a:graphicData>
+            </a:graphic>
+          </wp:inline>
+        </w:drawing>
+      </w:r>
+    </w:p>
+    <w:p>
+      <w:pPr>
+        <w:spacing w:after="220"/>
+        <w:jc w:val="center"/>
+      </w:pPr>
+      <w:r>
+        <w:rPr>
+          <w:i/>
+          <w:iCs/>
+          <w:color w:val="52514E"/>
+          <w:sz w:val="17"/>
+          <w:szCs w:val="17"/>
+        </w:rPr>
+        <w:t xml:space="preserve">Figure 6 — Summary: muzzle velocity as a function of barrel length. The curve is continuous over 5–26 in; the marked points are the barrel lengths of the standard configurations. The shape is the signature of diminishing returns — the marginal gain falls from 205 ft/s per inch at 5 in to 21 ft/s per inch at 22 in.</w:t>
+      </w:r>
+    </w:p>
+    <w:p>
+      <w:pPr>
+        <w:spacing w:after="130" w:line="276" w:lineRule="auto"/>
+      </w:pPr>
+      <w:r>
+        <w:t xml:space="preserve">Figure 6 answers the velocity half of the question at a glance, and the asymmetry of the curve is the point. Going from 14.5 in to 20 in — 5.5 in of extra barrel — buys only 57 m/s, while cutting from 14.5 in down to 10.3 in, a shorter change of 4.2 in, costs 88 m/s. Barrel length matters far more at the short end. The full numerical output follows.</w:t>
+      </w:r>
+    </w:p>
     <w:tbl>
       <w:tblPr>
         <w:tblW w:type="dxa" w:w="10400"/>
@@ -28317,7 +28387,7 @@
                     </pic:cNvPicPr>
                   </pic:nvPicPr>
                   <pic:blipFill>
-                    <a:blip r:embed="rId14" cstate="none"/>
+                    <a:blip r:embed="rId15" cstate="none"/>
                     <a:srcRect/>
                     <a:stretch>
                       <a:fillRect/>
@@ -28352,7 +28422,7 @@
           <w:sz w:val="17"/>
           <w:szCs w:val="17"/>
         </w:rPr>
-        <w:t xml:space="preserve">Figure 6 — Bullet-base pressure history for three barrel lengths. The three curves are identical until the shortest barrel uncorks: barrel length does not change the pressure history, it only decides where on that history the bullet leaves. The end point of each curve is its muzzle pressure.</w:t>
+        <w:t xml:space="preserve">Figure 7 — Bullet-base pressure history for three barrel lengths. The three curves are identical until the shortest barrel uncorks: barrel length does not change the pressure history, it only decides where on that history the bullet leaves. The end point of each curve is its muzzle pressure.</w:t>
       </w:r>
     </w:p>
     <w:p>
@@ -28389,68 +28459,6 @@
         <w:drawing>
           <wp:inline distT="0" distB="0" distL="0" distR="0">
             <wp:extent cx="5577840" cy="2428875"/>
-            <wp:effectExtent t="0" r="0" b="0" l="0"/>
-            <wp:docPr id="1" name="" descr="" title=""/>
-            <wp:cNvGraphicFramePr>
-              <a:graphicFrameLocks xmlns:a="http://schemas.openxmlformats.org/drawingml/2006/main" noChangeAspect="1"/>
-            </wp:cNvGraphicFramePr>
-            <a:graphic xmlns:a="http://schemas.openxmlformats.org/drawingml/2006/main">
-              <a:graphicData uri="http://schemas.openxmlformats.org/drawingml/2006/picture">
-                <pic:pic xmlns:pic="http://schemas.openxmlformats.org/drawingml/2006/picture">
-                  <pic:nvPicPr>
-                    <pic:cNvPr id="0" name="" descr=""/>
-                    <pic:cNvPicPr>
-                      <a:picLocks noChangeAspect="1" noChangeArrowheads="1"/>
-                    </pic:cNvPicPr>
-                  </pic:nvPicPr>
-                  <pic:blipFill>
-                    <a:blip r:embed="rId15" cstate="none"/>
-                    <a:srcRect/>
-                    <a:stretch>
-                      <a:fillRect/>
-                    </a:stretch>
-                  </pic:blipFill>
-                  <pic:spPr bwMode="auto">
-                    <a:xfrm>
-                      <a:off x="0" y="0"/>
-                      <a:ext cx="5577840" cy="2428875"/>
-                    </a:xfrm>
-                    <a:prstGeom prst="rect">
-                      <a:avLst/>
-                    </a:prstGeom>
-                  </pic:spPr>
-                </pic:pic>
-              </a:graphicData>
-            </a:graphic>
-          </wp:inline>
-        </w:drawing>
-      </w:r>
-    </w:p>
-    <w:p>
-      <w:pPr>
-        <w:spacing w:after="220"/>
-        <w:jc w:val="center"/>
-      </w:pPr>
-      <w:r>
-        <w:rPr>
-          <w:i/>
-          <w:iCs/>
-          <w:color w:val="52514E"/>
-          <w:sz w:val="17"/>
-          <w:szCs w:val="17"/>
-        </w:rPr>
-        <w:t xml:space="preserve">Figure 7 — Left: bullet-base pressure against bullet travel — the area under each curve, multiplied by the bore area, is the work delivered to the bullet. Right: velocity against time, showing how the acceleration has already fallen to a small value long before the muzzle of a long barrel.</w:t>
-      </w:r>
-    </w:p>
-    <w:p>
-      <w:pPr>
-        <w:spacing w:after="60" w:before="180" w:line="240" w:lineRule="auto"/>
-        <w:jc w:val="center"/>
-      </w:pPr>
-      <w:r>
-        <w:drawing>
-          <wp:inline distT="0" distB="0" distL="0" distR="0">
-            <wp:extent cx="5577840" cy="2343150"/>
             <wp:effectExtent t="0" r="0" b="0" l="0"/>
             <wp:docPr id="1" name="" descr="" title=""/>
             <wp:cNvGraphicFramePr>
@@ -28475,7 +28483,7 @@
                   <pic:spPr bwMode="auto">
                     <a:xfrm>
                       <a:off x="0" y="0"/>
-                      <a:ext cx="5577840" cy="2343150"/>
+                      <a:ext cx="5577840" cy="2428875"/>
                     </a:xfrm>
                     <a:prstGeom prst="rect">
                       <a:avLst/>
@@ -28501,504 +28509,7 @@
           <w:sz w:val="17"/>
           <w:szCs w:val="17"/>
         </w:rPr>
-        <w:t xml:space="preserve">Figure 8 — Left: the fraction of the charge consumed before the bullet exits. Below about 11.5 in the round leaves the barrel with propellant still burning. Right: barrel time, which grows almost linearly with barrel length.</w:t>
-      </w:r>
-    </w:p>
-    <w:p>
-      <w:pPr>
-        <w:pStyle w:val="Heading2"/>
-        <w:spacing w:after="110" w:before="260"/>
-      </w:pPr>
-      <w:r>
-        <w:t xml:space="preserve">10.3  Reading the numbers</w:t>
-      </w:r>
-    </w:p>
-    <w:p>
-      <w:pPr>
-        <w:spacing w:after="130" w:line="276" w:lineRule="auto"/>
-      </w:pPr>
-      <w:r>
-        <w:rPr>
-          <w:b/>
-          <w:bCs/>
-        </w:rPr>
-        <w:t xml:space="preserve">Velocity. </w:t>
-      </w:r>
-      <w:r>
-        <w:t xml:space="preserve">From 10.5 in to 20 in the muzzle velocity rises from 789 m/s to 928 m/s, a gain of 139 m/s or 17.7 %. The marginal gain falls monotonically: 205 ft/s per inch at 5 in, 60 ft/s per inch at 14.5 in, 21 ft/s per inch at 22 in. Past about 24 in the curve is nearly flat, and in reality friction eventually wins — the SADJ cut-barrel data show velocity peaking near 20 in and then falling, which this model does not reproduce because bore resistance is taken as constant (§11.5).</w:t>
-      </w:r>
-    </w:p>
-    <w:p>
-      <w:pPr>
-        <w:spacing w:after="130" w:line="276" w:lineRule="auto"/>
-      </w:pPr>
-      <w:r>
-        <w:rPr>
-          <w:b/>
-          <w:bCs/>
-        </w:rPr>
-        <w:t xml:space="preserve">Muzzle pressure. </w:t>
-      </w:r>
-      <w:r>
-        <w:t xml:space="preserve">Over that same change, the pressure behind the bullet at exit falls from 150 MPa to 51 MPa — a reduction of 66 % against a velocity gain of 18 %. Halving the barrel roughly triples the uncorking pressure. Since muzzle blast energy scales with the product of that pressure and the gas volume, and the volume is itself smaller in a short barrel, the practical scaling of blast is close to linear in uncorking pressure.</w:t>
-      </w:r>
-    </w:p>
-    <w:p>
-      <w:pPr>
-        <w:spacing w:after="130" w:line="276" w:lineRule="auto"/>
-      </w:pPr>
-      <w:r>
-        <w:rPr>
-          <w:b/>
-          <w:bCs/>
-        </w:rPr>
-        <w:t xml:space="preserve">Combustion completeness. </w:t>
-      </w:r>
-      <w:r>
-        <w:t xml:space="preserve">The charge is fully consumed at about 290 mm of travel, i.e. inside an 11.5 in barrel. Below that length the round leaves with unburnt propellant: 2 % at 10.5 in, 21 % at 7 in, 37 % at 5 in. That ejected propellant burns in the muzzle blast — this is the mechanism behind the pronounced flash of very short 5.56 barrels, and it is why flash suppressors matter far more on a 10.3 in weapon than on a 20 in one.</w:t>
-      </w:r>
-    </w:p>
-    <w:p>
-      <w:pPr>
-        <w:spacing w:after="130" w:line="276" w:lineRule="auto"/>
-      </w:pPr>
-      <w:r>
-        <w:rPr>
-          <w:b/>
-          <w:bCs/>
-        </w:rPr>
-        <w:t xml:space="preserve">Gas port. </w:t>
-      </w:r>
-      <w:r>
-        <w:t xml:space="preserve">For a direct-impingement AR the model reports the pressure at the port station as the bullet passes and thereafter. With a 12 in rifle-length port on a 20 in barrel it gives 58 MPa (8 400 psi) at bullet exit and a peak of 125 MPa (18 100 psi). Moving the same port to the 7.5 in carbine position on a 14.5 in barrel raises the exit value substantially — the well-known reason carbine gas systems run the bolt harder and are more sensitive to ammunition and suppressor back-pressure. The port position is a slider in the simulator.</w:t>
-      </w:r>
-    </w:p>
-    <w:p>
-      <w:r>
-        <w:br w:type="page"/>
-      </w:r>
-    </w:p>
-    <w:p>
-      <w:pPr>
-        <w:pStyle w:val="Heading1"/>
-        <w:spacing w:after="150" w:before="340"/>
-      </w:pPr>
-      <w:r>
-        <w:t xml:space="preserve">11  Model compromises and upgrade paths</w:t>
-      </w:r>
-    </w:p>
-    <w:p>
-      <w:pPr>
-        <w:spacing w:after="130" w:line="276" w:lineRule="auto"/>
-      </w:pPr>
-      <w:r>
-        <w:t xml:space="preserve">This section states what the lumped-parameter formulation gives up, and what the next model up the ladder would buy. They are ordered by cost.</w:t>
-      </w:r>
-    </w:p>
-    <w:p>
-      <w:pPr>
-        <w:pStyle w:val="Heading2"/>
-        <w:spacing w:after="110" w:before="260"/>
-      </w:pPr>
-      <w:r>
-        <w:t xml:space="preserve">11.1  What the lumped model assumes away</w:t>
-      </w:r>
-    </w:p>
-    <w:p>
-      <w:pPr>
-        <w:spacing w:after="130" w:line="276" w:lineRule="auto"/>
-      </w:pPr>
-      <w:r>
-        <w:rPr>
-          <w:b/>
-          <w:bCs/>
-        </w:rPr>
-        <w:t xml:space="preserve">No wave dynamics. </w:t>
-      </w:r>
-      <w:r>
-        <w:t xml:space="preserve">Assumption A1 replaces a compressible gas column with a single control volume. Real ignition is not simultaneous: the primer jet ignites the rear of the charge first and a combustion front sweeps forward, generating pressure waves that traverse the chamber several times during the shot. In small arms these are of order a few per cent of the peak pressure and decay quickly, so the lumped model is defensible; in large guns they are a design driver and can be destructive.</w:t>
-      </w:r>
-    </w:p>
-    <w:p>
-      <w:pPr>
-        <w:spacing w:after="130" w:line="276" w:lineRule="auto"/>
-      </w:pPr>
-      <w:r>
-        <w:rPr>
-          <w:b/>
-          <w:bCs/>
-        </w:rPr>
-        <w:t xml:space="preserve">No two-phase flow. </w:t>
-      </w:r>
-      <w:r>
-        <w:t xml:space="preserve">Assumption A5 makes the solid grains ride with the gas. In reality the grain bed is compacted by the initial pressure gradient, gas percolates through it, and the grains near the bullet base move at a different velocity from those at the breech. This is what a two-phase model resolves.</w:t>
-      </w:r>
-    </w:p>
-    <w:p>
-      <w:pPr>
-        <w:spacing w:after="130" w:line="276" w:lineRule="auto"/>
-      </w:pPr>
-      <w:r>
-        <w:rPr>
-          <w:b/>
-          <w:bCs/>
-        </w:rPr>
-        <w:t xml:space="preserve">Fixed thermochemistry. </w:t>
-      </w:r>
-      <w:r>
-        <w:t xml:space="preserve">Assumption A3 holds f, T_v, α and γ constant. At 2850 K and 400 MPa the combustion products are partly dissociated, and both γ and the effective impetus vary through the cycle. An equilibrium-chemistry code such as BLAKE or CHEETAH would supply p- and T-dependent properties.</w:t>
-      </w:r>
-    </w:p>
-    <w:p>
-      <w:pPr>
-        <w:spacing w:after="130" w:line="276" w:lineRule="auto"/>
-      </w:pPr>
-      <w:r>
-        <w:rPr>
-          <w:b/>
-          <w:bCs/>
-        </w:rPr>
-        <w:t xml:space="preserve">Crude bore resistance. </w:t>
-      </w:r>
-      <w:r>
-        <w:t xml:space="preserve">Assumption A7 is the weakest of the physical submodels. Measured bore resistance has a sharp engraving spike over the first few millimetres, then falls, then rises again with velocity as viscous and thermal effects in the bullet–bore interface grow. A constant p_r cannot capture the late rise, which is precisely why the model does not reproduce the observed velocity roll-over beyond about 20 in.</w:t>
-      </w:r>
-    </w:p>
-    <w:p>
-      <w:pPr>
-        <w:spacing w:after="130" w:line="276" w:lineRule="auto"/>
-      </w:pPr>
-      <w:r>
-        <w:rPr>
-          <w:b/>
-          <w:bCs/>
-        </w:rPr>
-        <w:t xml:space="preserve">No leakage, no bullet dynamics. </w:t>
-      </w:r>
-      <w:r>
-        <w:t xml:space="preserve">Assumption A9 ignores blow-by past an imperfectly obturating bullet and any change in the bullet’s length or diameter under 400 MPa of base pressure and 195 000 g of acceleration. Both would reduce the delivered impulse slightly and, importantly, both would tend to lower the computed muzzle pressure — a candidate explanation for the short-barrel discrepancy in §9.2.</w:t>
-      </w:r>
-    </w:p>
-    <w:p>
-      <w:pPr>
-        <w:pStyle w:val="Heading2"/>
-        <w:spacing w:after="110" w:before="260"/>
-      </w:pPr>
-      <w:r>
-        <w:t xml:space="preserve">11.2  Level 1.5 — the Lagrange gradient (already included)</w:t>
-      </w:r>
-    </w:p>
-    <w:p>
-      <w:pPr>
-        <w:spacing w:after="130" w:line="276" w:lineRule="auto"/>
-      </w:pPr>
-      <w:r>
-        <w:t xml:space="preserve">The cheapest possible improvement over a strictly uniform-pressure model is the Lagrange gradient of §4.6, and it is included here because it costs three lines of algebra and no computation at all. It converts a single pressure into a physically meaningful spatial distribution, which is what makes it possible to report breech, mean and base pressures separately — and to compute a gas-port pressure. For a cartridge with ζ = 0.40 the effect is a 20 % spread between breech and base, so it is not optional at this charge-to-mass ratio.</w:t>
-      </w:r>
-    </w:p>
-    <w:p>
-      <w:pPr>
-        <w:spacing w:after="130" w:line="276" w:lineRule="auto"/>
-      </w:pPr>
-      <w:r>
-        <w:rPr>
-          <w:b/>
-          <w:bCs/>
-        </w:rPr>
-        <w:t xml:space="preserve">What it still cannot do: </w:t>
-      </w:r>
-      <w:r>
-        <w:t xml:space="preserve">the Lagrange profile is a quasi-steady approximation. It has no wave content, and it assumes uniform gas density along the column, which is poor while the charge is still burning and gas is being created preferentially where the grains are.</w:t>
-      </w:r>
-    </w:p>
-    <w:p>
-      <w:pPr>
-        <w:pStyle w:val="Heading2"/>
-        <w:spacing w:after="110" w:before="260"/>
-      </w:pPr>
-      <w:r>
-        <w:t xml:space="preserve">11.3  Level 2 — one-dimensional gas dynamics</w:t>
-      </w:r>
-    </w:p>
-    <w:p>
-      <w:pPr>
-        <w:spacing w:after="130" w:line="276" w:lineRule="auto"/>
-      </w:pPr>
-      <w:r>
-        <w:t xml:space="preserve">The next step replaces the control volume with the one-dimensional Euler equations for the gas column, solved on a moving mesh between the breech face and the bullet base with a shock-capturing scheme. Mass, momentum and energy are conserved locally, with the propellant burn appearing as a distributed source term.</w:t>
-      </w:r>
-    </w:p>
-    <w:p>
-      <w:pPr>
-        <w:spacing w:after="130" w:line="276" w:lineRule="auto"/>
-      </w:pPr>
-      <w:r>
-        <w:rPr>
-          <w:b/>
-          <w:bCs/>
-        </w:rPr>
-        <w:t xml:space="preserve">What it buys: </w:t>
-      </w:r>
-      <w:r>
-        <w:t xml:space="preserve">genuine pressure waves and their reflections; a correct density distribution; a proper treatment of progressive ignition if the igniter is modelled as a distributed source; and — most relevant here — a physically-based rather than assumed pressure at any station, including the gas port and the muzzle.</w:t>
-      </w:r>
-    </w:p>
-    <w:p>
-      <w:pPr>
-        <w:spacing w:after="130" w:line="276" w:lineRule="auto"/>
-      </w:pPr>
-      <w:r>
-        <w:rPr>
-          <w:b/>
-          <w:bCs/>
-        </w:rPr>
-        <w:t xml:space="preserve">What it costs: </w:t>
-      </w:r>
-      <w:r>
-        <w:t xml:space="preserve">roughly three orders of magnitude more computation than the present model, and it introduces mesh and scheme dependence that must itself be verified. It would not run interactively in a browser.</w:t>
-      </w:r>
-    </w:p>
-    <w:p>
-      <w:pPr>
-        <w:pStyle w:val="Heading2"/>
-        <w:spacing w:after="110" w:before="260"/>
-      </w:pPr>
-      <w:r>
-        <w:t xml:space="preserve">11.4  Level 3 — two-phase reactive flow</w:t>
-      </w:r>
-    </w:p>
-    <w:p>
-      <w:pPr>
-        <w:spacing w:after="130" w:line="276" w:lineRule="auto"/>
-      </w:pPr>
-      <w:r>
-        <w:t xml:space="preserve">The reference formulation used in modern gun design (NGEN, XKTC, and their descendants) treats gas and solid propellant as two interpenetrating continua, each with its own velocity, with mass, momentum and energy exchange between them, intergranular stress in the packed bed, and a resolved ignition front.</w:t>
-      </w:r>
-    </w:p>
-    <w:p>
-      <w:pPr>
-        <w:spacing w:after="130" w:line="276" w:lineRule="auto"/>
-      </w:pPr>
-      <w:r>
-        <w:rPr>
-          <w:b/>
-          <w:bCs/>
-        </w:rPr>
-        <w:t xml:space="preserve">What it buys: </w:t>
-      </w:r>
-      <w:r>
-        <w:t xml:space="preserve">the ability to predict ignition-related phenomena that the lumped model cannot represent at all — hangfires, pressure-wave-driven overpressure, the effect of charge-bed settling and of primer output on round-to-round variation. For small arms it is the tool of choice when the question is about ignition robustness rather than about mean performance.</w:t>
-      </w:r>
-    </w:p>
-    <w:p>
-      <w:pPr>
-        <w:spacing w:after="130" w:line="276" w:lineRule="auto"/>
-      </w:pPr>
-      <w:r>
-        <w:rPr>
-          <w:b/>
-          <w:bCs/>
-        </w:rPr>
-        <w:t xml:space="preserve">What it costs: </w:t>
-      </w:r>
-      <w:r>
-        <w:t xml:space="preserve">a substantially larger parameter set — interphase drag, intergranular stress law, grain-bed permeability — most of which is not published for commercial propellants and must be measured. For the barrel-length question posed here it would add cost without adding accuracy.</w:t>
-      </w:r>
-    </w:p>
-    <w:p>
-      <w:pPr>
-        <w:pStyle w:val="Heading2"/>
-        <w:spacing w:after="110" w:before="260"/>
-      </w:pPr>
-      <w:r>
-        <w:t xml:space="preserve">11.5  Targeted improvements worth more than a level change</w:t>
-      </w:r>
-    </w:p>
-    <w:p>
-      <w:pPr>
-        <w:spacing w:after="130" w:line="276" w:lineRule="auto"/>
-        <w:ind w:left="340"/>
-      </w:pPr>
-      <w:r>
-        <w:rPr>
-          <w:b/>
-          <w:bCs/>
-        </w:rPr>
-        <w:t xml:space="preserve">1. A measured bore-resistance curve. </w:t>
-      </w:r>
-      <w:r>
-        <w:t xml:space="preserve">Replacing the constant p_r with a travel-dependent function p_r(x) — engraving spike, plateau, velocity-dependent rise — is a small code change and would let the model reproduce the velocity roll-over at long barrels. This is the highest-value single improvement.</w:t>
-      </w:r>
-    </w:p>
-    <w:p>
-      <w:pPr>
-        <w:spacing w:after="130" w:line="276" w:lineRule="auto"/>
-        <w:ind w:left="340"/>
-      </w:pPr>
-      <w:r>
-        <w:rPr>
-          <w:b/>
-          <w:bCs/>
-        </w:rPr>
-        <w:t xml:space="preserve">2. A closed-bomb characterisation of the actual propellant. </w:t>
-      </w:r>
-      <w:r>
-        <w:t xml:space="preserve">A single closed-bomb test of WC 844 would replace the three fitted parameters and the four generic thermochemical constants with measured values, and would convert the model from calibrated to predictive.</w:t>
-      </w:r>
-    </w:p>
-    <w:p>
-      <w:pPr>
-        <w:spacing w:after="130" w:line="276" w:lineRule="auto"/>
-        <w:ind w:left="340"/>
-      </w:pPr>
-      <w:r>
-        <w:rPr>
-          <w:b/>
-          <w:bCs/>
-        </w:rPr>
-        <w:t xml:space="preserve">3. A physically-scaled heat-transfer correlation. </w:t>
-      </w:r>
-      <w:r>
-        <w:t xml:space="preserve">Replacing the constant h with a Nusselt-type correlation, h ∝ Re⁰·⁸, would make the heat loss scale correctly with charge, calibre and pressure instead of being tied to this one cartridge.</w:t>
-      </w:r>
-    </w:p>
-    <w:p>
-      <w:pPr>
-        <w:spacing w:after="130" w:line="276" w:lineRule="auto"/>
-        <w:ind w:left="340"/>
-      </w:pPr>
-      <w:r>
-        <w:rPr>
-          <w:b/>
-          <w:bCs/>
-        </w:rPr>
-        <w:t xml:space="preserve">4. Gas leakage past the bullet. </w:t>
-      </w:r>
-      <w:r>
-        <w:t xml:space="preserve">A simple orifice model for blow-by, driven by the pressure difference across the bullet, is cheap and would test the hypothesis that leakage explains part of the short-barrel muzzle-pressure discrepancy.</w:t>
-      </w:r>
-    </w:p>
-    <w:p>
-      <w:pPr>
-        <w:spacing w:after="130" w:line="276" w:lineRule="auto"/>
-        <w:ind w:left="340"/>
-      </w:pPr>
-      <w:r>
-        <w:rPr>
-          <w:b/>
-          <w:bCs/>
-        </w:rPr>
-        <w:t xml:space="preserve">5. Muzzle and after-effect modelling. </w:t>
-      </w:r>
-      <w:r>
-        <w:t xml:space="preserve">The present model stops at bullet exit. The blast field, the additional 1–3 % of velocity imparted by the gas jet in the first few calibres of free flight, and suppressor back-pressure all follow from the uncorking conditions the model already computes, and would be a natural extension.</w:t>
-      </w:r>
-    </w:p>
-    <w:p>
-      <w:pPr>
-        <w:pStyle w:val="Heading1"/>
-        <w:spacing w:after="150" w:before="340"/>
-      </w:pPr>
-      <w:r>
-        <w:t xml:space="preserve">12  The companion simulator</w:t>
-      </w:r>
-    </w:p>
-    <w:p>
-      <w:pPr>
-        <w:spacing w:after="130" w:line="276" w:lineRule="auto"/>
-      </w:pPr>
-      <w:r>
-        <w:t xml:space="preserve">The file </w:t>
-      </w:r>
-      <w:r>
-        <w:rPr>
-          <w:i/>
-          <w:iCs/>
-        </w:rPr>
-        <w:t xml:space="preserve">web/ballistics.html</w:t>
-      </w:r>
-      <w:r>
-        <w:t xml:space="preserve"> is a single self-contained HTML document — no server, no build step, no external libraries. Opening it in any modern browser gives an interactive implementation of exactly the model derived above; the JavaScript is a line-by-line port of the Python reference and agrees with it to 0.021 % (§6).</w:t>
-      </w:r>
-    </w:p>
-    <w:p>
-      <w:pPr>
-        <w:spacing w:after="130" w:line="276" w:lineRule="auto"/>
-      </w:pPr>
-      <w:r>
-        <w:t xml:space="preserve">The interface has four tabs:</w:t>
-      </w:r>
-    </w:p>
-    <w:p>
-      <w:pPr>
-        <w:spacing w:after="130" w:line="276" w:lineRule="auto"/>
-        <w:ind w:left="340"/>
-      </w:pPr>
-      <w:r>
-        <w:rPr>
-          <w:b/>
-          <w:bCs/>
-        </w:rPr>
-        <w:t xml:space="preserve">Single shot. </w:t>
-      </w:r>
-      <w:r>
-        <w:t xml:space="preserve">Summary tiles for the reference quantities, then pressure versus time at all four stations, and pressure, velocity and travel versus time for up to five barrel lengths overlaid at once. This overlay is the clearest way to see the barrel-length effect: the curves coincide and each simply terminates at its own muzzle.</w:t>
-      </w:r>
-    </w:p>
-    <w:p>
-      <w:pPr>
-        <w:spacing w:after="130" w:line="276" w:lineRule="auto"/>
-        <w:ind w:left="340"/>
-      </w:pPr>
-      <w:r>
-        <w:rPr>
-          <w:b/>
-          <w:bCs/>
-        </w:rPr>
-        <w:t xml:space="preserve">Barrel-length sweep. </w:t>
-      </w:r>
-      <w:r>
-        <w:t xml:space="preserve">Muzzle velocity, uncorking pressure, muzzle energy, burnt fraction, barrel time and marginal velocity gain, each against barrel length from 5 in to 26 in, with the published measurements overlaid.</w:t>
-      </w:r>
-    </w:p>
-    <w:p>
-      <w:pPr>
-        <w:spacing w:after="130" w:line="276" w:lineRule="auto"/>
-        <w:ind w:left="340"/>
-      </w:pPr>
-      <w:r>
-        <w:rPr>
-          <w:b/>
-          <w:bCs/>
-        </w:rPr>
-        <w:t xml:space="preserve">Energy &amp; diagnostics. </w:t>
-      </w:r>
-      <w:r>
-        <w:t xml:space="preserve">The energy budget, gas-port pressure history, derived quantities such as loading density and expansion ratio, and a live time-step convergence check.</w:t>
-      </w:r>
-    </w:p>
-    <w:p>
-      <w:pPr>
-        <w:spacing w:after="130" w:line="276" w:lineRule="auto"/>
-        <w:ind w:left="340"/>
-      </w:pPr>
-      <w:r>
-        <w:rPr>
-          <w:b/>
-          <w:bCs/>
-        </w:rPr>
-        <w:t xml:space="preserve">Data table. </w:t>
-      </w:r>
-      <w:r>
-        <w:t xml:space="preserve">The full numerical output, plus a CSV export of both the time history and the sweep.</w:t>
-      </w:r>
-    </w:p>
-    <w:p>
-      <w:pPr>
-        <w:spacing w:after="130" w:line="276" w:lineRule="auto"/>
-      </w:pPr>
-      <w:r>
-        <w:t xml:space="preserve">Every parameter in §7 is exposed as a slider, grouped by category, with the derived quantity shown alongside. Cartridge presets are provided for M855, M193 and Mk262, and weapon presets for the M4, Mk18 and mid-length configurations. The page warns when a parameter combination becomes physically impossible — for instance when the charge mass and case volume imply a packing fraction above what spheres can achieve — or when peak pressure exceeds the NATO limit.</w:t>
+        <w:t xml:space="preserve">Figure 8 — Left: bullet-base pressure against bullet travel — the area under each curve, multiplied by the bore area, is the work delivered to the bullet. Right: velocity against time, showing how the acceleration has already fallen to a small value long before the muzzle of a long barrel.</w:t>
       </w:r>
     </w:p>
     <w:p>
@@ -29009,7 +28520,7 @@
       <w:r>
         <w:drawing>
           <wp:inline distT="0" distB="0" distL="0" distR="0">
-            <wp:extent cx="5760720" cy="3962400"/>
+            <wp:extent cx="5577840" cy="2343150"/>
             <wp:effectExtent t="0" r="0" b="0" l="0"/>
             <wp:docPr id="1" name="" descr="" title=""/>
             <wp:cNvGraphicFramePr>
@@ -29034,7 +28545,7 @@
                   <pic:spPr bwMode="auto">
                     <a:xfrm>
                       <a:off x="0" y="0"/>
-                      <a:ext cx="5760720" cy="3962400"/>
+                      <a:ext cx="5577840" cy="2343150"/>
                     </a:xfrm>
                     <a:prstGeom prst="rect">
                       <a:avLst/>
@@ -29060,7 +28571,504 @@
           <w:sz w:val="17"/>
           <w:szCs w:val="17"/>
         </w:rPr>
-        <w:t xml:space="preserve">Figure 9 — The single-shot tab of the simulator. The overlaid pressure curves for 10.5 in, 14.5 in and 20 in barrels coincide exactly, each terminating at its own muzzle-exit point.</w:t>
+        <w:t xml:space="preserve">Figure 9 — Left: the fraction of the charge consumed before the bullet exits. Below about 11.5 in the round leaves the barrel with propellant still burning. Right: barrel time, which grows almost linearly with barrel length.</w:t>
+      </w:r>
+    </w:p>
+    <w:p>
+      <w:pPr>
+        <w:pStyle w:val="Heading2"/>
+        <w:spacing w:after="110" w:before="260"/>
+      </w:pPr>
+      <w:r>
+        <w:t xml:space="preserve">10.3  Reading the numbers</w:t>
+      </w:r>
+    </w:p>
+    <w:p>
+      <w:pPr>
+        <w:spacing w:after="130" w:line="276" w:lineRule="auto"/>
+      </w:pPr>
+      <w:r>
+        <w:rPr>
+          <w:b/>
+          <w:bCs/>
+        </w:rPr>
+        <w:t xml:space="preserve">Velocity. </w:t>
+      </w:r>
+      <w:r>
+        <w:t xml:space="preserve">From 10.5 in to 20 in the muzzle velocity rises from 789 m/s to 928 m/s, a gain of 139 m/s or 17.7 %. The marginal gain falls monotonically: 205 ft/s per inch at 5 in, 60 ft/s per inch at 14.5 in, 21 ft/s per inch at 22 in. Past about 24 in the curve is nearly flat, and in reality friction eventually wins — the SADJ cut-barrel data show velocity peaking near 20 in and then falling, which this model does not reproduce because bore resistance is taken as constant (§11.5).</w:t>
+      </w:r>
+    </w:p>
+    <w:p>
+      <w:pPr>
+        <w:spacing w:after="130" w:line="276" w:lineRule="auto"/>
+      </w:pPr>
+      <w:r>
+        <w:rPr>
+          <w:b/>
+          <w:bCs/>
+        </w:rPr>
+        <w:t xml:space="preserve">Muzzle pressure. </w:t>
+      </w:r>
+      <w:r>
+        <w:t xml:space="preserve">Over that same change, the pressure behind the bullet at exit falls from 150 MPa to 51 MPa — a reduction of 66 % against a velocity gain of 18 %. Halving the barrel roughly triples the uncorking pressure. Since muzzle blast energy scales with the product of that pressure and the gas volume, and the volume is itself smaller in a short barrel, the practical scaling of blast is close to linear in uncorking pressure.</w:t>
+      </w:r>
+    </w:p>
+    <w:p>
+      <w:pPr>
+        <w:spacing w:after="130" w:line="276" w:lineRule="auto"/>
+      </w:pPr>
+      <w:r>
+        <w:rPr>
+          <w:b/>
+          <w:bCs/>
+        </w:rPr>
+        <w:t xml:space="preserve">Combustion completeness. </w:t>
+      </w:r>
+      <w:r>
+        <w:t xml:space="preserve">The charge is fully consumed at about 290 mm of travel, i.e. inside an 11.5 in barrel. Below that length the round leaves with unburnt propellant: 2 % at 10.5 in, 21 % at 7 in, 37 % at 5 in. That ejected propellant burns in the muzzle blast — this is the mechanism behind the pronounced flash of very short 5.56 barrels, and it is why flash suppressors matter far more on a 10.3 in weapon than on a 20 in one.</w:t>
+      </w:r>
+    </w:p>
+    <w:p>
+      <w:pPr>
+        <w:spacing w:after="130" w:line="276" w:lineRule="auto"/>
+      </w:pPr>
+      <w:r>
+        <w:rPr>
+          <w:b/>
+          <w:bCs/>
+        </w:rPr>
+        <w:t xml:space="preserve">Gas port. </w:t>
+      </w:r>
+      <w:r>
+        <w:t xml:space="preserve">For a direct-impingement AR the model reports the pressure at the port station as the bullet passes and thereafter. With a 12 in rifle-length port on a 20 in barrel it gives 58 MPa (8 400 psi) at bullet exit and a peak of 125 MPa (18 100 psi). Moving the same port to the 7.5 in carbine position on a 14.5 in barrel raises the exit value substantially — the well-known reason carbine gas systems run the bolt harder and are more sensitive to ammunition and suppressor back-pressure. The port position is a slider in the simulator.</w:t>
+      </w:r>
+    </w:p>
+    <w:p>
+      <w:r>
+        <w:br w:type="page"/>
+      </w:r>
+    </w:p>
+    <w:p>
+      <w:pPr>
+        <w:pStyle w:val="Heading1"/>
+        <w:spacing w:after="150" w:before="340"/>
+      </w:pPr>
+      <w:r>
+        <w:t xml:space="preserve">11  Model compromises and upgrade paths</w:t>
+      </w:r>
+    </w:p>
+    <w:p>
+      <w:pPr>
+        <w:spacing w:after="130" w:line="276" w:lineRule="auto"/>
+      </w:pPr>
+      <w:r>
+        <w:t xml:space="preserve">This section states what the lumped-parameter formulation gives up, and what the next model up the ladder would buy. They are ordered by cost.</w:t>
+      </w:r>
+    </w:p>
+    <w:p>
+      <w:pPr>
+        <w:pStyle w:val="Heading2"/>
+        <w:spacing w:after="110" w:before="260"/>
+      </w:pPr>
+      <w:r>
+        <w:t xml:space="preserve">11.1  What the lumped model assumes away</w:t>
+      </w:r>
+    </w:p>
+    <w:p>
+      <w:pPr>
+        <w:spacing w:after="130" w:line="276" w:lineRule="auto"/>
+      </w:pPr>
+      <w:r>
+        <w:rPr>
+          <w:b/>
+          <w:bCs/>
+        </w:rPr>
+        <w:t xml:space="preserve">No wave dynamics. </w:t>
+      </w:r>
+      <w:r>
+        <w:t xml:space="preserve">Assumption A1 replaces a compressible gas column with a single control volume. Real ignition is not simultaneous: the primer jet ignites the rear of the charge first and a combustion front sweeps forward, generating pressure waves that traverse the chamber several times during the shot. In small arms these are of order a few per cent of the peak pressure and decay quickly, so the lumped model is defensible; in large guns they are a design driver and can be destructive.</w:t>
+      </w:r>
+    </w:p>
+    <w:p>
+      <w:pPr>
+        <w:spacing w:after="130" w:line="276" w:lineRule="auto"/>
+      </w:pPr>
+      <w:r>
+        <w:rPr>
+          <w:b/>
+          <w:bCs/>
+        </w:rPr>
+        <w:t xml:space="preserve">No two-phase flow. </w:t>
+      </w:r>
+      <w:r>
+        <w:t xml:space="preserve">Assumption A5 makes the solid grains ride with the gas. In reality the grain bed is compacted by the initial pressure gradient, gas percolates through it, and the grains near the bullet base move at a different velocity from those at the breech. This is what a two-phase model resolves.</w:t>
+      </w:r>
+    </w:p>
+    <w:p>
+      <w:pPr>
+        <w:spacing w:after="130" w:line="276" w:lineRule="auto"/>
+      </w:pPr>
+      <w:r>
+        <w:rPr>
+          <w:b/>
+          <w:bCs/>
+        </w:rPr>
+        <w:t xml:space="preserve">Fixed thermochemistry. </w:t>
+      </w:r>
+      <w:r>
+        <w:t xml:space="preserve">Assumption A3 holds f, T_v, α and γ constant. At 2850 K and 400 MPa the combustion products are partly dissociated, and both γ and the effective impetus vary through the cycle. An equilibrium-chemistry code such as BLAKE or CHEETAH would supply p- and T-dependent properties.</w:t>
+      </w:r>
+    </w:p>
+    <w:p>
+      <w:pPr>
+        <w:spacing w:after="130" w:line="276" w:lineRule="auto"/>
+      </w:pPr>
+      <w:r>
+        <w:rPr>
+          <w:b/>
+          <w:bCs/>
+        </w:rPr>
+        <w:t xml:space="preserve">Crude bore resistance. </w:t>
+      </w:r>
+      <w:r>
+        <w:t xml:space="preserve">Assumption A7 is the weakest of the physical submodels. Measured bore resistance has a sharp engraving spike over the first few millimetres, then falls, then rises again with velocity as viscous and thermal effects in the bullet–bore interface grow. A constant p_r cannot capture the late rise, which is precisely why the model does not reproduce the observed velocity roll-over beyond about 20 in.</w:t>
+      </w:r>
+    </w:p>
+    <w:p>
+      <w:pPr>
+        <w:spacing w:after="130" w:line="276" w:lineRule="auto"/>
+      </w:pPr>
+      <w:r>
+        <w:rPr>
+          <w:b/>
+          <w:bCs/>
+        </w:rPr>
+        <w:t xml:space="preserve">No leakage, no bullet dynamics. </w:t>
+      </w:r>
+      <w:r>
+        <w:t xml:space="preserve">Assumption A9 ignores blow-by past an imperfectly obturating bullet and any change in the bullet’s length or diameter under 400 MPa of base pressure and 195 000 g of acceleration. Both would reduce the delivered impulse slightly and, importantly, both would tend to lower the computed muzzle pressure — a candidate explanation for the short-barrel discrepancy in §9.2.</w:t>
+      </w:r>
+    </w:p>
+    <w:p>
+      <w:pPr>
+        <w:pStyle w:val="Heading2"/>
+        <w:spacing w:after="110" w:before="260"/>
+      </w:pPr>
+      <w:r>
+        <w:t xml:space="preserve">11.2  Level 1.5 — the Lagrange gradient (already included)</w:t>
+      </w:r>
+    </w:p>
+    <w:p>
+      <w:pPr>
+        <w:spacing w:after="130" w:line="276" w:lineRule="auto"/>
+      </w:pPr>
+      <w:r>
+        <w:t xml:space="preserve">The cheapest possible improvement over a strictly uniform-pressure model is the Lagrange gradient of §4.6, and it is included here because it costs three lines of algebra and no computation at all. It converts a single pressure into a physically meaningful spatial distribution, which is what makes it possible to report breech, mean and base pressures separately — and to compute a gas-port pressure. For a cartridge with ζ = 0.40 the effect is a 20 % spread between breech and base, so it is not optional at this charge-to-mass ratio.</w:t>
+      </w:r>
+    </w:p>
+    <w:p>
+      <w:pPr>
+        <w:spacing w:after="130" w:line="276" w:lineRule="auto"/>
+      </w:pPr>
+      <w:r>
+        <w:rPr>
+          <w:b/>
+          <w:bCs/>
+        </w:rPr>
+        <w:t xml:space="preserve">What it still cannot do: </w:t>
+      </w:r>
+      <w:r>
+        <w:t xml:space="preserve">the Lagrange profile is a quasi-steady approximation. It has no wave content, and it assumes uniform gas density along the column, which is poor while the charge is still burning and gas is being created preferentially where the grains are.</w:t>
+      </w:r>
+    </w:p>
+    <w:p>
+      <w:pPr>
+        <w:pStyle w:val="Heading2"/>
+        <w:spacing w:after="110" w:before="260"/>
+      </w:pPr>
+      <w:r>
+        <w:t xml:space="preserve">11.3  Level 2 — one-dimensional gas dynamics</w:t>
+      </w:r>
+    </w:p>
+    <w:p>
+      <w:pPr>
+        <w:spacing w:after="130" w:line="276" w:lineRule="auto"/>
+      </w:pPr>
+      <w:r>
+        <w:t xml:space="preserve">The next step replaces the control volume with the one-dimensional Euler equations for the gas column, solved on a moving mesh between the breech face and the bullet base with a shock-capturing scheme. Mass, momentum and energy are conserved locally, with the propellant burn appearing as a distributed source term.</w:t>
+      </w:r>
+    </w:p>
+    <w:p>
+      <w:pPr>
+        <w:spacing w:after="130" w:line="276" w:lineRule="auto"/>
+      </w:pPr>
+      <w:r>
+        <w:rPr>
+          <w:b/>
+          <w:bCs/>
+        </w:rPr>
+        <w:t xml:space="preserve">What it buys: </w:t>
+      </w:r>
+      <w:r>
+        <w:t xml:space="preserve">genuine pressure waves and their reflections; a correct density distribution; a proper treatment of progressive ignition if the igniter is modelled as a distributed source; and — most relevant here — a physically-based rather than assumed pressure at any station, including the gas port and the muzzle.</w:t>
+      </w:r>
+    </w:p>
+    <w:p>
+      <w:pPr>
+        <w:spacing w:after="130" w:line="276" w:lineRule="auto"/>
+      </w:pPr>
+      <w:r>
+        <w:rPr>
+          <w:b/>
+          <w:bCs/>
+        </w:rPr>
+        <w:t xml:space="preserve">What it costs: </w:t>
+      </w:r>
+      <w:r>
+        <w:t xml:space="preserve">roughly three orders of magnitude more computation than the present model, and it introduces mesh and scheme dependence that must itself be verified. It would not run interactively in a browser.</w:t>
+      </w:r>
+    </w:p>
+    <w:p>
+      <w:pPr>
+        <w:pStyle w:val="Heading2"/>
+        <w:spacing w:after="110" w:before="260"/>
+      </w:pPr>
+      <w:r>
+        <w:t xml:space="preserve">11.4  Level 3 — two-phase reactive flow</w:t>
+      </w:r>
+    </w:p>
+    <w:p>
+      <w:pPr>
+        <w:spacing w:after="130" w:line="276" w:lineRule="auto"/>
+      </w:pPr>
+      <w:r>
+        <w:t xml:space="preserve">The reference formulation used in modern gun design (NGEN, XKTC, and their descendants) treats gas and solid propellant as two interpenetrating continua, each with its own velocity, with mass, momentum and energy exchange between them, intergranular stress in the packed bed, and a resolved ignition front.</w:t>
+      </w:r>
+    </w:p>
+    <w:p>
+      <w:pPr>
+        <w:spacing w:after="130" w:line="276" w:lineRule="auto"/>
+      </w:pPr>
+      <w:r>
+        <w:rPr>
+          <w:b/>
+          <w:bCs/>
+        </w:rPr>
+        <w:t xml:space="preserve">What it buys: </w:t>
+      </w:r>
+      <w:r>
+        <w:t xml:space="preserve">the ability to predict ignition-related phenomena that the lumped model cannot represent at all — hangfires, pressure-wave-driven overpressure, the effect of charge-bed settling and of primer output on round-to-round variation. For small arms it is the tool of choice when the question is about ignition robustness rather than about mean performance.</w:t>
+      </w:r>
+    </w:p>
+    <w:p>
+      <w:pPr>
+        <w:spacing w:after="130" w:line="276" w:lineRule="auto"/>
+      </w:pPr>
+      <w:r>
+        <w:rPr>
+          <w:b/>
+          <w:bCs/>
+        </w:rPr>
+        <w:t xml:space="preserve">What it costs: </w:t>
+      </w:r>
+      <w:r>
+        <w:t xml:space="preserve">a substantially larger parameter set — interphase drag, intergranular stress law, grain-bed permeability — most of which is not published for commercial propellants and must be measured. For the barrel-length question posed here it would add cost without adding accuracy.</w:t>
+      </w:r>
+    </w:p>
+    <w:p>
+      <w:pPr>
+        <w:pStyle w:val="Heading2"/>
+        <w:spacing w:after="110" w:before="260"/>
+      </w:pPr>
+      <w:r>
+        <w:t xml:space="preserve">11.5  Targeted improvements worth more than a level change</w:t>
+      </w:r>
+    </w:p>
+    <w:p>
+      <w:pPr>
+        <w:spacing w:after="130" w:line="276" w:lineRule="auto"/>
+        <w:ind w:left="340"/>
+      </w:pPr>
+      <w:r>
+        <w:rPr>
+          <w:b/>
+          <w:bCs/>
+        </w:rPr>
+        <w:t xml:space="preserve">1. A measured bore-resistance curve. </w:t>
+      </w:r>
+      <w:r>
+        <w:t xml:space="preserve">Replacing the constant p_r with a travel-dependent function p_r(x) — engraving spike, plateau, velocity-dependent rise — is a small code change and would let the model reproduce the velocity roll-over at long barrels. This is the highest-value single improvement.</w:t>
+      </w:r>
+    </w:p>
+    <w:p>
+      <w:pPr>
+        <w:spacing w:after="130" w:line="276" w:lineRule="auto"/>
+        <w:ind w:left="340"/>
+      </w:pPr>
+      <w:r>
+        <w:rPr>
+          <w:b/>
+          <w:bCs/>
+        </w:rPr>
+        <w:t xml:space="preserve">2. A closed-bomb characterisation of the actual propellant. </w:t>
+      </w:r>
+      <w:r>
+        <w:t xml:space="preserve">A single closed-bomb test of WC 844 would replace the three fitted parameters and the four generic thermochemical constants with measured values, and would convert the model from calibrated to predictive.</w:t>
+      </w:r>
+    </w:p>
+    <w:p>
+      <w:pPr>
+        <w:spacing w:after="130" w:line="276" w:lineRule="auto"/>
+        <w:ind w:left="340"/>
+      </w:pPr>
+      <w:r>
+        <w:rPr>
+          <w:b/>
+          <w:bCs/>
+        </w:rPr>
+        <w:t xml:space="preserve">3. A physically-scaled heat-transfer correlation. </w:t>
+      </w:r>
+      <w:r>
+        <w:t xml:space="preserve">Replacing the constant h with a Nusselt-type correlation, h ∝ Re⁰·⁸, would make the heat loss scale correctly with charge, calibre and pressure instead of being tied to this one cartridge.</w:t>
+      </w:r>
+    </w:p>
+    <w:p>
+      <w:pPr>
+        <w:spacing w:after="130" w:line="276" w:lineRule="auto"/>
+        <w:ind w:left="340"/>
+      </w:pPr>
+      <w:r>
+        <w:rPr>
+          <w:b/>
+          <w:bCs/>
+        </w:rPr>
+        <w:t xml:space="preserve">4. Gas leakage past the bullet. </w:t>
+      </w:r>
+      <w:r>
+        <w:t xml:space="preserve">A simple orifice model for blow-by, driven by the pressure difference across the bullet, is cheap and would test the hypothesis that leakage explains part of the short-barrel muzzle-pressure discrepancy.</w:t>
+      </w:r>
+    </w:p>
+    <w:p>
+      <w:pPr>
+        <w:spacing w:after="130" w:line="276" w:lineRule="auto"/>
+        <w:ind w:left="340"/>
+      </w:pPr>
+      <w:r>
+        <w:rPr>
+          <w:b/>
+          <w:bCs/>
+        </w:rPr>
+        <w:t xml:space="preserve">5. Muzzle and after-effect modelling. </w:t>
+      </w:r>
+      <w:r>
+        <w:t xml:space="preserve">The present model stops at bullet exit. The blast field, the additional 1–3 % of velocity imparted by the gas jet in the first few calibres of free flight, and suppressor back-pressure all follow from the uncorking conditions the model already computes, and would be a natural extension.</w:t>
+      </w:r>
+    </w:p>
+    <w:p>
+      <w:pPr>
+        <w:pStyle w:val="Heading1"/>
+        <w:spacing w:after="150" w:before="340"/>
+      </w:pPr>
+      <w:r>
+        <w:t xml:space="preserve">12  The companion simulator</w:t>
+      </w:r>
+    </w:p>
+    <w:p>
+      <w:pPr>
+        <w:spacing w:after="130" w:line="276" w:lineRule="auto"/>
+      </w:pPr>
+      <w:r>
+        <w:t xml:space="preserve">The file </w:t>
+      </w:r>
+      <w:r>
+        <w:rPr>
+          <w:i/>
+          <w:iCs/>
+        </w:rPr>
+        <w:t xml:space="preserve">web/ballistics.html</w:t>
+      </w:r>
+      <w:r>
+        <w:t xml:space="preserve"> is a single self-contained HTML document — no server, no build step, no external libraries. Opening it in any modern browser gives an interactive implementation of exactly the model derived above; the JavaScript is a line-by-line port of the Python reference and agrees with it to 0.021 % (§6).</w:t>
+      </w:r>
+    </w:p>
+    <w:p>
+      <w:pPr>
+        <w:spacing w:after="130" w:line="276" w:lineRule="auto"/>
+      </w:pPr>
+      <w:r>
+        <w:t xml:space="preserve">The interface has four tabs:</w:t>
+      </w:r>
+    </w:p>
+    <w:p>
+      <w:pPr>
+        <w:spacing w:after="130" w:line="276" w:lineRule="auto"/>
+        <w:ind w:left="340"/>
+      </w:pPr>
+      <w:r>
+        <w:rPr>
+          <w:b/>
+          <w:bCs/>
+        </w:rPr>
+        <w:t xml:space="preserve">Single shot. </w:t>
+      </w:r>
+      <w:r>
+        <w:t xml:space="preserve">Summary tiles for the reference quantities, then pressure versus time at all four stations, and pressure, velocity and travel versus time for up to five barrel lengths overlaid at once. This overlay is the clearest way to see the barrel-length effect: the curves coincide and each simply terminates at its own muzzle.</w:t>
+      </w:r>
+    </w:p>
+    <w:p>
+      <w:pPr>
+        <w:spacing w:after="130" w:line="276" w:lineRule="auto"/>
+        <w:ind w:left="340"/>
+      </w:pPr>
+      <w:r>
+        <w:rPr>
+          <w:b/>
+          <w:bCs/>
+        </w:rPr>
+        <w:t xml:space="preserve">Barrel-length sweep. </w:t>
+      </w:r>
+      <w:r>
+        <w:t xml:space="preserve">Muzzle velocity, uncorking pressure, muzzle energy, burnt fraction, barrel time and marginal velocity gain, each against barrel length from 5 in to 26 in, with the published measurements overlaid.</w:t>
+      </w:r>
+    </w:p>
+    <w:p>
+      <w:pPr>
+        <w:spacing w:after="130" w:line="276" w:lineRule="auto"/>
+        <w:ind w:left="340"/>
+      </w:pPr>
+      <w:r>
+        <w:rPr>
+          <w:b/>
+          <w:bCs/>
+        </w:rPr>
+        <w:t xml:space="preserve">Energy &amp; diagnostics. </w:t>
+      </w:r>
+      <w:r>
+        <w:t xml:space="preserve">The energy budget, gas-port pressure history, derived quantities such as loading density and expansion ratio, and a live time-step convergence check.</w:t>
+      </w:r>
+    </w:p>
+    <w:p>
+      <w:pPr>
+        <w:spacing w:after="130" w:line="276" w:lineRule="auto"/>
+        <w:ind w:left="340"/>
+      </w:pPr>
+      <w:r>
+        <w:rPr>
+          <w:b/>
+          <w:bCs/>
+        </w:rPr>
+        <w:t xml:space="preserve">Data table. </w:t>
+      </w:r>
+      <w:r>
+        <w:t xml:space="preserve">The full numerical output, plus a CSV export of both the time history and the sweep.</w:t>
+      </w:r>
+    </w:p>
+    <w:p>
+      <w:pPr>
+        <w:spacing w:after="130" w:line="276" w:lineRule="auto"/>
+      </w:pPr>
+      <w:r>
+        <w:t xml:space="preserve">Every parameter in §7 is exposed as a slider, grouped by category, with the derived quantity shown alongside. Cartridge presets are provided for M855, M193 and Mk262, and weapon presets for the M4, Mk18 and mid-length configurations. The page warns when a parameter combination becomes physically impossible — for instance when the charge mass and case volume imply a packing fraction above what spheres can achieve — or when peak pressure exceeds the NATO limit.</w:t>
       </w:r>
     </w:p>
     <w:p>
@@ -29071,7 +29079,7 @@
       <w:r>
         <w:drawing>
           <wp:inline distT="0" distB="0" distL="0" distR="0">
-            <wp:extent cx="5760720" cy="4857750"/>
+            <wp:extent cx="5760720" cy="3962400"/>
             <wp:effectExtent t="0" r="0" b="0" l="0"/>
             <wp:docPr id="1" name="" descr="" title=""/>
             <wp:cNvGraphicFramePr>
@@ -29096,6 +29104,68 @@
                   <pic:spPr bwMode="auto">
                     <a:xfrm>
                       <a:off x="0" y="0"/>
+                      <a:ext cx="5760720" cy="3962400"/>
+                    </a:xfrm>
+                    <a:prstGeom prst="rect">
+                      <a:avLst/>
+                    </a:prstGeom>
+                  </pic:spPr>
+                </pic:pic>
+              </a:graphicData>
+            </a:graphic>
+          </wp:inline>
+        </w:drawing>
+      </w:r>
+    </w:p>
+    <w:p>
+      <w:pPr>
+        <w:spacing w:after="220"/>
+        <w:jc w:val="center"/>
+      </w:pPr>
+      <w:r>
+        <w:rPr>
+          <w:i/>
+          <w:iCs/>
+          <w:color w:val="52514E"/>
+          <w:sz w:val="17"/>
+          <w:szCs w:val="17"/>
+        </w:rPr>
+        <w:t xml:space="preserve">Figure 10 — The single-shot tab of the simulator. The overlaid pressure curves for 10.5 in, 14.5 in and 20 in barrels coincide exactly, each terminating at its own muzzle-exit point.</w:t>
+      </w:r>
+    </w:p>
+    <w:p>
+      <w:pPr>
+        <w:spacing w:after="60" w:before="180" w:line="240" w:lineRule="auto"/>
+        <w:jc w:val="center"/>
+      </w:pPr>
+      <w:r>
+        <w:drawing>
+          <wp:inline distT="0" distB="0" distL="0" distR="0">
+            <wp:extent cx="5760720" cy="4857750"/>
+            <wp:effectExtent t="0" r="0" b="0" l="0"/>
+            <wp:docPr id="1" name="" descr="" title=""/>
+            <wp:cNvGraphicFramePr>
+              <a:graphicFrameLocks xmlns:a="http://schemas.openxmlformats.org/drawingml/2006/main" noChangeAspect="1"/>
+            </wp:cNvGraphicFramePr>
+            <a:graphic xmlns:a="http://schemas.openxmlformats.org/drawingml/2006/main">
+              <a:graphicData uri="http://schemas.openxmlformats.org/drawingml/2006/picture">
+                <pic:pic xmlns:pic="http://schemas.openxmlformats.org/drawingml/2006/picture">
+                  <pic:nvPicPr>
+                    <pic:cNvPr id="0" name="" descr=""/>
+                    <pic:cNvPicPr>
+                      <a:picLocks noChangeAspect="1" noChangeArrowheads="1"/>
+                    </pic:cNvPicPr>
+                  </pic:nvPicPr>
+                  <pic:blipFill>
+                    <a:blip r:embed="rId19" cstate="none"/>
+                    <a:srcRect/>
+                    <a:stretch>
+                      <a:fillRect/>
+                    </a:stretch>
+                  </pic:blipFill>
+                  <pic:spPr bwMode="auto">
+                    <a:xfrm>
+                      <a:off x="0" y="0"/>
                       <a:ext cx="5760720" cy="4857750"/>
                     </a:xfrm>
                     <a:prstGeom prst="rect">
@@ -29122,7 +29192,7 @@
           <w:sz w:val="17"/>
           <w:szCs w:val="17"/>
         </w:rPr>
-        <w:t xml:space="preserve">Figure 10 — The barrel-length sweep tab, with published chronograph and uncorking-pressure measurements overlaid on the model curves.</w:t>
+        <w:t xml:space="preserve">Figure 11 — The barrel-length sweep tab, with published chronograph and uncorking-pressure measurements overlaid on the model curves.</w:t>
       </w:r>
     </w:p>
     <w:p>
@@ -29802,7 +29872,7 @@
       <w:r>
         <w:t xml:space="preserve">Lucky Gunner Labs, "223 / 5.56 Ballistics: Barrel Length vs. Velocity" — cut-barrel test of Winchester M855 62 gr and other loads at 7, 10.5, 14.5, 16, 18 and 22 in.  </w:t>
       </w:r>
-      <w:hyperlink w:history="1" r:id="rIdvy3xxvlmj-5msojnd1td9">
+      <w:hyperlink w:history="1" r:id="rIdv9musqs47lex-92ucwwbg">
         <w:r>
           <w:rPr>
             <w:rStyle w:val="Hyperlink"/>
@@ -29819,7 +29889,7 @@
       <w:r>
         <w:t xml:space="preserve">D. E. Watters, "Barrel Length Studies in 5.56 mm NATO Weapons", Small Arms Defense Journal — cut-barrel study from 24 in to 5 in with instrumented ports; source of the uncorking-pressure data and of the 55 744 psi chamber-pressure measurement.  </w:t>
       </w:r>
-      <w:hyperlink w:history="1" r:id="rIdahc4ntn25xdotebla9d-m">
+      <w:hyperlink w:history="1" r:id="rIdsnjltox4oncdyjsegubmx">
         <w:r>
           <w:rPr>
             <w:rStyle w:val="Hyperlink"/>
@@ -29836,7 +29906,7 @@
       <w:r>
         <w:t xml:space="preserve">The Firearm Blog, "Cartridge Test 008: PMC M855 5.56×45 mm 62 gr, 16 and 20 in barrels".  </w:t>
       </w:r>
-      <w:hyperlink w:history="1" r:id="rIdr99iv32wzl3shxfzvgkfe">
+      <w:hyperlink w:history="1" r:id="rId_mmvvq9uk7z0z3jbmbknp">
         <w:r>
           <w:rPr>
             <w:rStyle w:val="Hyperlink"/>
@@ -29853,7 +29923,7 @@
       <w:r>
         <w:t xml:space="preserve">P. Dater, "Suppressor Design and Muzzle Pressure", NDIA Armament Systems Forum — method and instrumentation for muzzle-port pressure measurement.  </w:t>
       </w:r>
-      <w:hyperlink w:history="1" r:id="rIdsxayrzh7u_l9qfblkqdim">
+      <w:hyperlink w:history="1" r:id="rId_o4s5jeauhn6xbgpvyfw2">
         <w:r>
           <w:rPr>
             <w:rStyle w:val="Hyperlink"/>
@@ -29870,7 +29940,7 @@
       <w:r>
         <w:t xml:space="preserve">International Journal of Metrology and Quality Engineering (2026) — EPVAT proof-barrel measurements of SS109: 343.70 ± 7.29 MPa case-mouth peak pressure, 926.39 ± 3.57 m/s velocity, 116.61 MPa port pressure, n = 30.  </w:t>
       </w:r>
-      <w:hyperlink w:history="1" r:id="rIdvme9hr7dyekl5ax1nyet1">
+      <w:hyperlink w:history="1" r:id="rIdbtdkcwtgyceq-tmq8ptrx">
         <w:r>
           <w:rPr>
             <w:rStyle w:val="Hyperlink"/>
@@ -29896,7 +29966,7 @@
       <w:r>
         <w:t xml:space="preserve">"5.56×45 mm NATO" — case and cartridge dimensions, case capacity, EPVAT and SCATP pressure limits.  </w:t>
       </w:r>
-      <w:hyperlink w:history="1" r:id="rIdegb62shdr1pcik3sbqc82">
+      <w:hyperlink w:history="1" r:id="rIdjui8rcd87vhoai-dbfawi">
         <w:r>
           <w:rPr>
             <w:rStyle w:val="Hyperlink"/>
@@ -29913,7 +29983,7 @@
       <w:r>
         <w:t xml:space="preserve">".223 Remington" — SAAMI maximum average pressure, case capacity, groove diameter.  </w:t>
       </w:r>
-      <w:hyperlink w:history="1" r:id="rIdc6b9zexrpadkdjame_7pi">
+      <w:hyperlink w:history="1" r:id="rIdweyqtwl30szacq4uwnanh">
         <w:r>
           <w:rPr>
             <w:rStyle w:val="Hyperlink"/>
@@ -29930,7 +30000,7 @@
       <w:r>
         <w:t xml:space="preserve">inetres.com, "5.56 mm ammunition" — M855 projectile mass, cartridge mass, nominal muzzle velocity.  </w:t>
       </w:r>
-      <w:hyperlink w:history="1" r:id="rId7lv-xwc1i1dxgklmys6to">
+      <w:hyperlink w:history="1" r:id="rIdko9q09oyvquqc5trfdsvf">
         <w:r>
           <w:rPr>
             <w:rStyle w:val="Hyperlink"/>
@@ -29947,7 +30017,7 @@
       <w:r>
         <w:t xml:space="preserve">General Dynamics / St. Marks Powder, military ball powder brochure — confirms WC 844 as the qualified propellant for M855.  </w:t>
       </w:r>
-      <w:hyperlink w:history="1" r:id="rIdzrfstigdweao5089nws85">
+      <w:hyperlink w:history="1" r:id="rIduti18-3zh_hu6bbk6qmxu">
         <w:r>
           <w:rPr>
             <w:rStyle w:val="Hyperlink"/>
@@ -29973,7 +30043,7 @@
       <w:r>
         <w:t xml:space="preserve">Middle East Technical University, thesis on interior ballistics modelling — generic single-base propellant constants (f = 0.98 MJ kg⁻¹, α = 1.0 cm³ g⁻¹, T_v = 2825 K, γ = 1.24, Vieille n = 0.69) and the lumped-parameter formulation.  </w:t>
       </w:r>
-      <w:hyperlink w:history="1" r:id="rIdywpc4dujad6wj6wixvf2z">
+      <w:hyperlink w:history="1" r:id="rIdmdwiypxfqsxbblcpvf8so">
         <w:r>
           <w:rPr>
             <w:rStyle w:val="Hyperlink"/>
@@ -29990,7 +30060,7 @@
       <w:r>
         <w:t xml:space="preserve">US Army Research Laboratory / BLAKE thermochemical data for M1 single-base propellant — force 911.7–919.2 J g⁻¹, T_v 2343–2447 K, covolume 1.1044 cm³ g⁻¹, γ 1.2675.  </w:t>
       </w:r>
-      <w:hyperlink w:history="1" r:id="rIdx-edz8p8a1yt0qu1kehju">
+      <w:hyperlink w:history="1" r:id="rIdhznu1ewixcgnf0tj3ila4">
         <w:r>
           <w:rPr>
             <w:rStyle w:val="Hyperlink"/>
@@ -30007,7 +30077,7 @@
       <w:r>
         <w:t xml:space="preserve">US Army Research Laboratory, "Measuring Barrel Friction in the 5.56 mm NATO", ADA555779 — method for extracting bore friction from muzzle-energy versus charge-mass data.  </w:t>
       </w:r>
-      <w:hyperlink w:history="1" r:id="rIdtx0euwxmkxlmonhximvln">
+      <w:hyperlink w:history="1" r:id="rIdiyh4o531psza5bnnfpzp2">
         <w:r>
           <w:rPr>
             <w:rStyle w:val="Hyperlink"/>

</xml_diff>

<commit_message>
Attribute to Teknosofen; add byline to the simulator header
</commit_message>
<xml_diff>
--- a/doc/5.56_interior_ballistics.docx
+++ b/doc/5.56_interior_ballistics.docx
@@ -58,9 +58,6 @@
         <w:spacing w:after="130" w:line="276" w:lineRule="auto"/>
       </w:pPr>
       <w:r>
-        <w:t xml:space="preserve">Prepared for </w:t>
-      </w:r>
-      <w:r>
         <w:rPr>
           <w:b/>
           <w:bCs/>
@@ -68,7 +65,7 @@
         <w:t xml:space="preserve">Åke Larsson</w:t>
       </w:r>
       <w:r>
-        <w:t xml:space="preserve">, Getinge Critical Care.</w:t>
+        <w:t xml:space="preserve"> — Teknosofen.</w:t>
       </w:r>
     </w:p>
     <w:p>
@@ -78,7 +75,7 @@
       <w:r>
         <w:t xml:space="preserve">Model, source code and this document: </w:t>
       </w:r>
-      <w:hyperlink w:history="1" r:id="rIdfsgec4pjbloxlh0ojm-6f">
+      <w:hyperlink w:history="1" r:id="rIdl5squuilkwfu-tshzrnw7">
         <w:r>
           <w:rPr>
             <w:rStyle w:val="Hyperlink"/>
@@ -29872,7 +29869,7 @@
       <w:r>
         <w:t xml:space="preserve">Lucky Gunner Labs, "223 / 5.56 Ballistics: Barrel Length vs. Velocity" — cut-barrel test of Winchester M855 62 gr and other loads at 7, 10.5, 14.5, 16, 18 and 22 in.  </w:t>
       </w:r>
-      <w:hyperlink w:history="1" r:id="rIdv9musqs47lex-92ucwwbg">
+      <w:hyperlink w:history="1" r:id="rIdlsk5qiub_xrbgp4a8vp80">
         <w:r>
           <w:rPr>
             <w:rStyle w:val="Hyperlink"/>
@@ -29889,7 +29886,7 @@
       <w:r>
         <w:t xml:space="preserve">D. E. Watters, "Barrel Length Studies in 5.56 mm NATO Weapons", Small Arms Defense Journal — cut-barrel study from 24 in to 5 in with instrumented ports; source of the uncorking-pressure data and of the 55 744 psi chamber-pressure measurement.  </w:t>
       </w:r>
-      <w:hyperlink w:history="1" r:id="rIdsnjltox4oncdyjsegubmx">
+      <w:hyperlink w:history="1" r:id="rIdfls2ijtadzue7nbputa-l">
         <w:r>
           <w:rPr>
             <w:rStyle w:val="Hyperlink"/>
@@ -29906,7 +29903,7 @@
       <w:r>
         <w:t xml:space="preserve">The Firearm Blog, "Cartridge Test 008: PMC M855 5.56×45 mm 62 gr, 16 and 20 in barrels".  </w:t>
       </w:r>
-      <w:hyperlink w:history="1" r:id="rId_mmvvq9uk7z0z3jbmbknp">
+      <w:hyperlink w:history="1" r:id="rId3c7cfszjroytrwmc6rtow">
         <w:r>
           <w:rPr>
             <w:rStyle w:val="Hyperlink"/>
@@ -29923,7 +29920,7 @@
       <w:r>
         <w:t xml:space="preserve">P. Dater, "Suppressor Design and Muzzle Pressure", NDIA Armament Systems Forum — method and instrumentation for muzzle-port pressure measurement.  </w:t>
       </w:r>
-      <w:hyperlink w:history="1" r:id="rId_o4s5jeauhn6xbgpvyfw2">
+      <w:hyperlink w:history="1" r:id="rIdynn87fb-6gb90iy3bhxat">
         <w:r>
           <w:rPr>
             <w:rStyle w:val="Hyperlink"/>
@@ -29940,7 +29937,7 @@
       <w:r>
         <w:t xml:space="preserve">International Journal of Metrology and Quality Engineering (2026) — EPVAT proof-barrel measurements of SS109: 343.70 ± 7.29 MPa case-mouth peak pressure, 926.39 ± 3.57 m/s velocity, 116.61 MPa port pressure, n = 30.  </w:t>
       </w:r>
-      <w:hyperlink w:history="1" r:id="rIdbtdkcwtgyceq-tmq8ptrx">
+      <w:hyperlink w:history="1" r:id="rIdgm_xp1nfw39ccwzvw0txw">
         <w:r>
           <w:rPr>
             <w:rStyle w:val="Hyperlink"/>
@@ -29966,7 +29963,7 @@
       <w:r>
         <w:t xml:space="preserve">"5.56×45 mm NATO" — case and cartridge dimensions, case capacity, EPVAT and SCATP pressure limits.  </w:t>
       </w:r>
-      <w:hyperlink w:history="1" r:id="rIdjui8rcd87vhoai-dbfawi">
+      <w:hyperlink w:history="1" r:id="rId0tz3wqxdqreeuiycdxhj1">
         <w:r>
           <w:rPr>
             <w:rStyle w:val="Hyperlink"/>
@@ -29983,7 +29980,7 @@
       <w:r>
         <w:t xml:space="preserve">".223 Remington" — SAAMI maximum average pressure, case capacity, groove diameter.  </w:t>
       </w:r>
-      <w:hyperlink w:history="1" r:id="rIdweyqtwl30szacq4uwnanh">
+      <w:hyperlink w:history="1" r:id="rId0upm4rrlh9kscrz5gg9l3">
         <w:r>
           <w:rPr>
             <w:rStyle w:val="Hyperlink"/>
@@ -30000,7 +29997,7 @@
       <w:r>
         <w:t xml:space="preserve">inetres.com, "5.56 mm ammunition" — M855 projectile mass, cartridge mass, nominal muzzle velocity.  </w:t>
       </w:r>
-      <w:hyperlink w:history="1" r:id="rIdko9q09oyvquqc5trfdsvf">
+      <w:hyperlink w:history="1" r:id="rIdpist8lwq2rzouslpowqi4">
         <w:r>
           <w:rPr>
             <w:rStyle w:val="Hyperlink"/>
@@ -30017,7 +30014,7 @@
       <w:r>
         <w:t xml:space="preserve">General Dynamics / St. Marks Powder, military ball powder brochure — confirms WC 844 as the qualified propellant for M855.  </w:t>
       </w:r>
-      <w:hyperlink w:history="1" r:id="rIduti18-3zh_hu6bbk6qmxu">
+      <w:hyperlink w:history="1" r:id="rIdmwy1phak3xiowjpcahi0g">
         <w:r>
           <w:rPr>
             <w:rStyle w:val="Hyperlink"/>
@@ -30043,7 +30040,7 @@
       <w:r>
         <w:t xml:space="preserve">Middle East Technical University, thesis on interior ballistics modelling — generic single-base propellant constants (f = 0.98 MJ kg⁻¹, α = 1.0 cm³ g⁻¹, T_v = 2825 K, γ = 1.24, Vieille n = 0.69) and the lumped-parameter formulation.  </w:t>
       </w:r>
-      <w:hyperlink w:history="1" r:id="rIdmdwiypxfqsxbblcpvf8so">
+      <w:hyperlink w:history="1" r:id="rIdlibay1szroaqfuoj1lh_-">
         <w:r>
           <w:rPr>
             <w:rStyle w:val="Hyperlink"/>
@@ -30060,7 +30057,7 @@
       <w:r>
         <w:t xml:space="preserve">US Army Research Laboratory / BLAKE thermochemical data for M1 single-base propellant — force 911.7–919.2 J g⁻¹, T_v 2343–2447 K, covolume 1.1044 cm³ g⁻¹, γ 1.2675.  </w:t>
       </w:r>
-      <w:hyperlink w:history="1" r:id="rIdhznu1ewixcgnf0tj3ila4">
+      <w:hyperlink w:history="1" r:id="rIddh1xuodekuthlgxuz4kys">
         <w:r>
           <w:rPr>
             <w:rStyle w:val="Hyperlink"/>
@@ -30077,7 +30074,7 @@
       <w:r>
         <w:t xml:space="preserve">US Army Research Laboratory, "Measuring Barrel Friction in the 5.56 mm NATO", ADA555779 — method for extracting bore friction from muzzle-energy versus charge-mass data.  </w:t>
       </w:r>
-      <w:hyperlink w:history="1" r:id="rIdiyh4o531psza5bnnfpzp2">
+      <w:hyperlink w:history="1" r:id="rIdphq7la1pntebpx3zxpavh">
         <w:r>
           <w:rPr>
             <w:rStyle w:val="Hyperlink"/>

</xml_diff>